<commit_message>
Caso 2 Actividad 1 RPA
</commit_message>
<xml_diff>
--- a/RPA/ACTIVIDAD 1/miunar04_act1.docx
+++ b/RPA/ACTIVIDAD 1/miunar04_act1.docx
@@ -982,7 +982,7 @@
           <w:ilvl w:val="0"/>
           <w:numId w:val="0"/>
         </w:numPr>
-        <w:ind w:left="284"/>
+        <w:ind w:left="284" w:firstLine="425"/>
       </w:pPr>
       <w:r>
         <w:t>Si, porque encuentra la ruta óptima para llegar al destino, su coste es 9</w:t>
@@ -994,6 +994,652 @@
       </w:pPr>
       <w:r>
         <w:t>¿Obtiene profundidad un resultado óptimo? ¿Por qué?</w:t>
+      </w:r>
+    </w:p>
+    <w:p>
+      <w:pPr>
+        <w:pStyle w:val="ListanumeradaTEST"/>
+        <w:numPr>
+          <w:ilvl w:val="0"/>
+          <w:numId w:val="0"/>
+        </w:numPr>
+        <w:ind w:left="284" w:firstLine="425"/>
+      </w:pPr>
+      <w:r>
+        <w:t xml:space="preserve">No, porque sabiendo que la ruta </w:t>
+      </w:r>
+      <w:r>
+        <w:t>óptima</w:t>
+      </w:r>
+      <w:r>
+        <w:t xml:space="preserve"> para llegar es 9, con profundidad tenemos 15</w:t>
+      </w:r>
+    </w:p>
+    <w:p>
+      <w:pPr>
+        <w:pStyle w:val="ListanumeradaTEST"/>
+      </w:pPr>
+      <w:r>
+        <w:t>¿Cuál de los dos algoritmos es más eficiente en este caso particular? Justifique su respuesta.</w:t>
+      </w:r>
+    </w:p>
+    <w:p>
+      <w:pPr>
+        <w:pStyle w:val="ListanumeradaTEST"/>
+        <w:numPr>
+          <w:ilvl w:val="0"/>
+          <w:numId w:val="0"/>
+        </w:numPr>
+        <w:ind w:left="709"/>
+      </w:pPr>
+      <w:r>
+        <w:t>En este caso, aunque amplitud encuentre el resultado óptimo, profundidad es un algoritmo más eficiente, ya que visitando menos casillas encuentra una solución.</w:t>
+      </w:r>
+      <w:r>
+        <w:br/>
+        <w:t>Amplitud visita 27 y profundidad 20</w:t>
+      </w:r>
+    </w:p>
+    <w:p/>
+    <w:p>
+      <w:r>
+        <w:rPr>
+          <w:b/>
+          <w:bCs/>
+        </w:rPr>
+        <w:t>Caso 2</w:t>
+      </w:r>
+      <w:r>
+        <w:t xml:space="preserve">. En este caso se deben probar y </w:t>
+      </w:r>
+      <w:r>
+        <w:rPr>
+          <w:b/>
+          <w:bCs/>
+        </w:rPr>
+        <w:t>comparar los algoritmos de búsqueda amplitud, Dijkstra y A* cuando hay costes distintos de 1</w:t>
+      </w:r>
+      <w:r>
+        <w:t>. Vea que los ficheros contienen costes modificados para este caso. Para A*, observe que el código proporciona una función heurística basada en la distancia de Manhattan.</w:t>
+      </w:r>
+    </w:p>
+    <w:p/>
+    <w:p/>
+    <w:p/>
+    <w:p/>
+    <w:p/>
+    <w:p/>
+    <w:p/>
+    <w:p/>
+    <w:p/>
+    <w:p/>
+    <w:p/>
+    <w:p>
+      <w:pPr>
+        <w:pStyle w:val="ListanumeradaTEST"/>
+        <w:numPr>
+          <w:ilvl w:val="0"/>
+          <w:numId w:val="47"/>
+        </w:numPr>
+      </w:pPr>
+      <w:r>
+        <w:t>Muestre una tabla con los datos de todas las ejecuciones.</w:t>
+      </w:r>
+    </w:p>
+    <w:tbl>
+      <w:tblPr>
+        <w:tblStyle w:val="Tablaconcuadrcula1clara-nfasis1"/>
+        <w:tblW w:w="0" w:type="auto"/>
+        <w:tblLook w:val="04A0" w:firstRow="1" w:lastRow="0" w:firstColumn="1" w:lastColumn="0" w:noHBand="0" w:noVBand="1"/>
+      </w:tblPr>
+      <w:tblGrid>
+        <w:gridCol w:w="1321"/>
+        <w:gridCol w:w="1321"/>
+        <w:gridCol w:w="1321"/>
+        <w:gridCol w:w="1321"/>
+        <w:gridCol w:w="1365"/>
+        <w:gridCol w:w="1321"/>
+      </w:tblGrid>
+      <w:tr>
+        <w:trPr>
+          <w:cnfStyle w:val="100000000000" w:firstRow="1" w:lastRow="0" w:firstColumn="0" w:lastColumn="0" w:oddVBand="0" w:evenVBand="0" w:oddHBand="0" w:evenHBand="0" w:firstRowFirstColumn="0" w:firstRowLastColumn="0" w:lastRowFirstColumn="0" w:lastRowLastColumn="0"/>
+        </w:trPr>
+        <w:tc>
+          <w:tcPr>
+            <w:cnfStyle w:val="001000000000" w:firstRow="0" w:lastRow="0" w:firstColumn="1" w:lastColumn="0" w:oddVBand="0" w:evenVBand="0" w:oddHBand="0" w:evenHBand="0" w:firstRowFirstColumn="0" w:firstRowLastColumn="0" w:lastRowFirstColumn="0" w:lastRowLastColumn="0"/>
+            <w:tcW w:w="1321" w:type="dxa"/>
+          </w:tcPr>
+          <w:p>
+            <w:pPr>
+              <w:pStyle w:val="ListanumeradaTEST"/>
+              <w:numPr>
+                <w:ilvl w:val="0"/>
+                <w:numId w:val="0"/>
+              </w:numPr>
+            </w:pPr>
+            <w:r>
+              <w:lastRenderedPageBreak/>
+              <w:t>Algoritmo</w:t>
+            </w:r>
+          </w:p>
+        </w:tc>
+        <w:tc>
+          <w:tcPr>
+            <w:tcW w:w="1321" w:type="dxa"/>
+          </w:tcPr>
+          <w:p>
+            <w:pPr>
+              <w:pStyle w:val="ListanumeradaTEST"/>
+              <w:numPr>
+                <w:ilvl w:val="0"/>
+                <w:numId w:val="0"/>
+              </w:numPr>
+              <w:cnfStyle w:val="100000000000" w:firstRow="1" w:lastRow="0" w:firstColumn="0" w:lastColumn="0" w:oddVBand="0" w:evenVBand="0" w:oddHBand="0" w:evenHBand="0" w:firstRowFirstColumn="0" w:firstRowLastColumn="0" w:lastRowFirstColumn="0" w:lastRowLastColumn="0"/>
+            </w:pPr>
+            <w:r>
+              <w:t>Solución</w:t>
+            </w:r>
+          </w:p>
+        </w:tc>
+        <w:tc>
+          <w:tcPr>
+            <w:tcW w:w="1321" w:type="dxa"/>
+          </w:tcPr>
+          <w:p>
+            <w:pPr>
+              <w:pStyle w:val="ListanumeradaTEST"/>
+              <w:numPr>
+                <w:ilvl w:val="0"/>
+                <w:numId w:val="0"/>
+              </w:numPr>
+              <w:cnfStyle w:val="100000000000" w:firstRow="1" w:lastRow="0" w:firstColumn="0" w:lastColumn="0" w:oddVBand="0" w:evenVBand="0" w:oddHBand="0" w:evenHBand="0" w:firstRowFirstColumn="0" w:firstRowLastColumn="0" w:lastRowFirstColumn="0" w:lastRowLastColumn="0"/>
+            </w:pPr>
+            <w:r>
+              <w:t>Longitud</w:t>
+            </w:r>
+          </w:p>
+        </w:tc>
+        <w:tc>
+          <w:tcPr>
+            <w:tcW w:w="1321" w:type="dxa"/>
+          </w:tcPr>
+          <w:p>
+            <w:pPr>
+              <w:pStyle w:val="ListanumeradaTEST"/>
+              <w:numPr>
+                <w:ilvl w:val="0"/>
+                <w:numId w:val="0"/>
+              </w:numPr>
+              <w:cnfStyle w:val="100000000000" w:firstRow="1" w:lastRow="0" w:firstColumn="0" w:lastColumn="0" w:oddVBand="0" w:evenVBand="0" w:oddHBand="0" w:evenHBand="0" w:firstRowFirstColumn="0" w:firstRowLastColumn="0" w:lastRowFirstColumn="0" w:lastRowLastColumn="0"/>
+            </w:pPr>
+            <w:r>
+              <w:t>Coste solución</w:t>
+            </w:r>
+          </w:p>
+        </w:tc>
+        <w:tc>
+          <w:tcPr>
+            <w:tcW w:w="1365" w:type="dxa"/>
+          </w:tcPr>
+          <w:p>
+            <w:pPr>
+              <w:pStyle w:val="ListanumeradaTEST"/>
+              <w:numPr>
+                <w:ilvl w:val="0"/>
+                <w:numId w:val="0"/>
+              </w:numPr>
+              <w:cnfStyle w:val="100000000000" w:firstRow="1" w:lastRow="0" w:firstColumn="0" w:lastColumn="0" w:oddVBand="0" w:evenVBand="0" w:oddHBand="0" w:evenHBand="0" w:firstRowFirstColumn="0" w:firstRowLastColumn="0" w:lastRowFirstColumn="0" w:lastRowLastColumn="0"/>
+            </w:pPr>
+            <w:r>
+              <w:t>Nodos expandidos</w:t>
+            </w:r>
+          </w:p>
+        </w:tc>
+        <w:tc>
+          <w:tcPr>
+            <w:tcW w:w="1321" w:type="dxa"/>
+          </w:tcPr>
+          <w:p>
+            <w:pPr>
+              <w:pStyle w:val="ListanumeradaTEST"/>
+              <w:numPr>
+                <w:ilvl w:val="0"/>
+                <w:numId w:val="0"/>
+              </w:numPr>
+              <w:cnfStyle w:val="100000000000" w:firstRow="1" w:lastRow="0" w:firstColumn="0" w:lastColumn="0" w:oddVBand="0" w:evenVBand="0" w:oddHBand="0" w:evenHBand="0" w:firstRowFirstColumn="0" w:firstRowLastColumn="0" w:lastRowFirstColumn="0" w:lastRowLastColumn="0"/>
+            </w:pPr>
+            <w:r>
+              <w:t>Tamaño máximo de lista</w:t>
+            </w:r>
+          </w:p>
+        </w:tc>
+      </w:tr>
+      <w:tr>
+        <w:tc>
+          <w:tcPr>
+            <w:cnfStyle w:val="001000000000" w:firstRow="0" w:lastRow="0" w:firstColumn="1" w:lastColumn="0" w:oddVBand="0" w:evenVBand="0" w:oddHBand="0" w:evenHBand="0" w:firstRowFirstColumn="0" w:firstRowLastColumn="0" w:lastRowFirstColumn="0" w:lastRowLastColumn="0"/>
+            <w:tcW w:w="1321" w:type="dxa"/>
+          </w:tcPr>
+          <w:p>
+            <w:pPr>
+              <w:pStyle w:val="ListanumeradaTEST"/>
+              <w:numPr>
+                <w:ilvl w:val="0"/>
+                <w:numId w:val="0"/>
+              </w:numPr>
+              <w:rPr>
+                <w:b w:val="0"/>
+                <w:bCs w:val="0"/>
+              </w:rPr>
+            </w:pPr>
+            <w:r>
+              <w:rPr>
+                <w:b w:val="0"/>
+                <w:bCs w:val="0"/>
+              </w:rPr>
+              <w:t>Amplitud</w:t>
+            </w:r>
+          </w:p>
+        </w:tc>
+        <w:tc>
+          <w:tcPr>
+            <w:tcW w:w="1321" w:type="dxa"/>
+          </w:tcPr>
+          <w:p>
+            <w:pPr>
+              <w:pStyle w:val="ListanumeradaTEST"/>
+              <w:numPr>
+                <w:ilvl w:val="0"/>
+                <w:numId w:val="0"/>
+              </w:numPr>
+              <w:cnfStyle w:val="000000000000" w:firstRow="0" w:lastRow="0" w:firstColumn="0" w:lastColumn="0" w:oddVBand="0" w:evenVBand="0" w:oddHBand="0" w:evenHBand="0" w:firstRowFirstColumn="0" w:firstRowLastColumn="0" w:lastRowFirstColumn="0" w:lastRowLastColumn="0"/>
+            </w:pPr>
+            <w:r>
+              <w:t>B1 -&gt; C1 -&gt; D1 -&gt; E1 -&gt; F1 -&gt; G1 -&gt; G2 -&gt; G3 -&gt; F3 -&gt; E3</w:t>
+            </w:r>
+          </w:p>
+        </w:tc>
+        <w:tc>
+          <w:tcPr>
+            <w:tcW w:w="1321" w:type="dxa"/>
+          </w:tcPr>
+          <w:p>
+            <w:pPr>
+              <w:pStyle w:val="ListanumeradaTEST"/>
+              <w:numPr>
+                <w:ilvl w:val="0"/>
+                <w:numId w:val="0"/>
+              </w:numPr>
+              <w:cnfStyle w:val="000000000000" w:firstRow="0" w:lastRow="0" w:firstColumn="0" w:lastColumn="0" w:oddVBand="0" w:evenVBand="0" w:oddHBand="0" w:evenHBand="0" w:firstRowFirstColumn="0" w:firstRowLastColumn="0" w:lastRowFirstColumn="0" w:lastRowLastColumn="0"/>
+            </w:pPr>
+            <w:r>
+              <w:t>10</w:t>
+            </w:r>
+          </w:p>
+        </w:tc>
+        <w:tc>
+          <w:tcPr>
+            <w:tcW w:w="1321" w:type="dxa"/>
+          </w:tcPr>
+          <w:p>
+            <w:pPr>
+              <w:pStyle w:val="ListanumeradaTEST"/>
+              <w:numPr>
+                <w:ilvl w:val="0"/>
+                <w:numId w:val="0"/>
+              </w:numPr>
+              <w:cnfStyle w:val="000000000000" w:firstRow="0" w:lastRow="0" w:firstColumn="0" w:lastColumn="0" w:oddVBand="0" w:evenVBand="0" w:oddHBand="0" w:evenHBand="0" w:firstRowFirstColumn="0" w:firstRowLastColumn="0" w:lastRowFirstColumn="0" w:lastRowLastColumn="0"/>
+            </w:pPr>
+            <w:r>
+              <w:t>15</w:t>
+            </w:r>
+          </w:p>
+        </w:tc>
+        <w:tc>
+          <w:tcPr>
+            <w:tcW w:w="1365" w:type="dxa"/>
+          </w:tcPr>
+          <w:p>
+            <w:pPr>
+              <w:pStyle w:val="ListanumeradaTEST"/>
+              <w:numPr>
+                <w:ilvl w:val="0"/>
+                <w:numId w:val="0"/>
+              </w:numPr>
+              <w:cnfStyle w:val="000000000000" w:firstRow="0" w:lastRow="0" w:firstColumn="0" w:lastColumn="0" w:oddVBand="0" w:evenVBand="0" w:oddHBand="0" w:evenHBand="0" w:firstRowFirstColumn="0" w:firstRowLastColumn="0" w:lastRowFirstColumn="0" w:lastRowLastColumn="0"/>
+            </w:pPr>
+            <w:r>
+              <w:t>2</w:t>
+            </w:r>
+            <w:r>
+              <w:t>6</w:t>
+            </w:r>
+          </w:p>
+        </w:tc>
+        <w:tc>
+          <w:tcPr>
+            <w:tcW w:w="1321" w:type="dxa"/>
+          </w:tcPr>
+          <w:p>
+            <w:pPr>
+              <w:pStyle w:val="ListanumeradaTEST"/>
+              <w:numPr>
+                <w:ilvl w:val="0"/>
+                <w:numId w:val="0"/>
+              </w:numPr>
+              <w:cnfStyle w:val="000000000000" w:firstRow="0" w:lastRow="0" w:firstColumn="0" w:lastColumn="0" w:oddVBand="0" w:evenVBand="0" w:oddHBand="0" w:evenHBand="0" w:firstRowFirstColumn="0" w:firstRowLastColumn="0" w:lastRowFirstColumn="0" w:lastRowLastColumn="0"/>
+            </w:pPr>
+            <w:r>
+              <w:t>7</w:t>
+            </w:r>
+          </w:p>
+        </w:tc>
+      </w:tr>
+      <w:tr>
+        <w:tc>
+          <w:tcPr>
+            <w:cnfStyle w:val="001000000000" w:firstRow="0" w:lastRow="0" w:firstColumn="1" w:lastColumn="0" w:oddVBand="0" w:evenVBand="0" w:oddHBand="0" w:evenHBand="0" w:firstRowFirstColumn="0" w:firstRowLastColumn="0" w:lastRowFirstColumn="0" w:lastRowLastColumn="0"/>
+            <w:tcW w:w="1321" w:type="dxa"/>
+          </w:tcPr>
+          <w:p>
+            <w:pPr>
+              <w:pStyle w:val="ListanumeradaTEST"/>
+              <w:numPr>
+                <w:ilvl w:val="0"/>
+                <w:numId w:val="0"/>
+              </w:numPr>
+              <w:rPr>
+                <w:b w:val="0"/>
+                <w:bCs w:val="0"/>
+              </w:rPr>
+            </w:pPr>
+            <w:r>
+              <w:rPr>
+                <w:b w:val="0"/>
+                <w:bCs w:val="0"/>
+              </w:rPr>
+              <w:t>Dijkstra</w:t>
+            </w:r>
+          </w:p>
+        </w:tc>
+        <w:tc>
+          <w:tcPr>
+            <w:tcW w:w="1321" w:type="dxa"/>
+          </w:tcPr>
+          <w:p>
+            <w:pPr>
+              <w:pStyle w:val="ListanumeradaTEST"/>
+              <w:numPr>
+                <w:ilvl w:val="0"/>
+                <w:numId w:val="0"/>
+              </w:numPr>
+              <w:cnfStyle w:val="000000000000" w:firstRow="0" w:lastRow="0" w:firstColumn="0" w:lastColumn="0" w:oddVBand="0" w:evenVBand="0" w:oddHBand="0" w:evenHBand="0" w:firstRowFirstColumn="0" w:firstRowLastColumn="0" w:lastRowFirstColumn="0" w:lastRowLastColumn="0"/>
+            </w:pPr>
+            <w:r>
+              <w:t>B1 -&gt; A1 -&gt; A2 -&gt; A3 -&gt; A4 -&gt; A5 -&gt;</w:t>
+            </w:r>
+          </w:p>
+          <w:p>
+            <w:pPr>
+              <w:pStyle w:val="ListanumeradaTEST"/>
+              <w:numPr>
+                <w:ilvl w:val="0"/>
+                <w:numId w:val="0"/>
+              </w:numPr>
+              <w:cnfStyle w:val="000000000000" w:firstRow="0" w:lastRow="0" w:firstColumn="0" w:lastColumn="0" w:oddVBand="0" w:evenVBand="0" w:oddHBand="0" w:evenHBand="0" w:firstRowFirstColumn="0" w:firstRowLastColumn="0" w:lastRowFirstColumn="0" w:lastRowLastColumn="0"/>
+            </w:pPr>
+            <w:r>
+              <w:t xml:space="preserve">B5 -&gt; C5 -&gt; D5 -&gt; </w:t>
+            </w:r>
+            <w:r>
+              <w:t>D4</w:t>
+            </w:r>
+            <w:r>
+              <w:t xml:space="preserve"> -&gt; </w:t>
+            </w:r>
+            <w:r>
+              <w:t>C4</w:t>
+            </w:r>
+            <w:r>
+              <w:t xml:space="preserve"> </w:t>
+            </w:r>
+            <w:r>
+              <w:t>-&gt;</w:t>
+            </w:r>
+            <w:r>
+              <w:t xml:space="preserve"> E3</w:t>
+            </w:r>
+          </w:p>
+        </w:tc>
+        <w:tc>
+          <w:tcPr>
+            <w:tcW w:w="1321" w:type="dxa"/>
+          </w:tcPr>
+          <w:p>
+            <w:pPr>
+              <w:pStyle w:val="ListanumeradaTEST"/>
+              <w:numPr>
+                <w:ilvl w:val="0"/>
+                <w:numId w:val="0"/>
+              </w:numPr>
+              <w:cnfStyle w:val="000000000000" w:firstRow="0" w:lastRow="0" w:firstColumn="0" w:lastColumn="0" w:oddVBand="0" w:evenVBand="0" w:oddHBand="0" w:evenHBand="0" w:firstRowFirstColumn="0" w:firstRowLastColumn="0" w:lastRowFirstColumn="0" w:lastRowLastColumn="0"/>
+            </w:pPr>
+            <w:r>
+              <w:t>1</w:t>
+            </w:r>
+            <w:r>
+              <w:t>2</w:t>
+            </w:r>
+          </w:p>
+        </w:tc>
+        <w:tc>
+          <w:tcPr>
+            <w:tcW w:w="1321" w:type="dxa"/>
+          </w:tcPr>
+          <w:p>
+            <w:pPr>
+              <w:pStyle w:val="ListanumeradaTEST"/>
+              <w:numPr>
+                <w:ilvl w:val="0"/>
+                <w:numId w:val="0"/>
+              </w:numPr>
+              <w:cnfStyle w:val="000000000000" w:firstRow="0" w:lastRow="0" w:firstColumn="0" w:lastColumn="0" w:oddVBand="0" w:evenVBand="0" w:oddHBand="0" w:evenHBand="0" w:firstRowFirstColumn="0" w:firstRowLastColumn="0" w:lastRowFirstColumn="0" w:lastRowLastColumn="0"/>
+            </w:pPr>
+            <w:r>
+              <w:t>1</w:t>
+            </w:r>
+            <w:r>
+              <w:t>4</w:t>
+            </w:r>
+          </w:p>
+        </w:tc>
+        <w:tc>
+          <w:tcPr>
+            <w:tcW w:w="1365" w:type="dxa"/>
+          </w:tcPr>
+          <w:p>
+            <w:pPr>
+              <w:pStyle w:val="ListanumeradaTEST"/>
+              <w:numPr>
+                <w:ilvl w:val="0"/>
+                <w:numId w:val="0"/>
+              </w:numPr>
+              <w:cnfStyle w:val="000000000000" w:firstRow="0" w:lastRow="0" w:firstColumn="0" w:lastColumn="0" w:oddVBand="0" w:evenVBand="0" w:oddHBand="0" w:evenHBand="0" w:firstRowFirstColumn="0" w:firstRowLastColumn="0" w:lastRowFirstColumn="0" w:lastRowLastColumn="0"/>
+            </w:pPr>
+            <w:r>
+              <w:t>3</w:t>
+            </w:r>
+            <w:r>
+              <w:t>3</w:t>
+            </w:r>
+          </w:p>
+        </w:tc>
+        <w:tc>
+          <w:tcPr>
+            <w:tcW w:w="1321" w:type="dxa"/>
+          </w:tcPr>
+          <w:p>
+            <w:pPr>
+              <w:pStyle w:val="ListanumeradaTEST"/>
+              <w:numPr>
+                <w:ilvl w:val="0"/>
+                <w:numId w:val="0"/>
+              </w:numPr>
+              <w:cnfStyle w:val="000000000000" w:firstRow="0" w:lastRow="0" w:firstColumn="0" w:lastColumn="0" w:oddVBand="0" w:evenVBand="0" w:oddHBand="0" w:evenHBand="0" w:firstRowFirstColumn="0" w:firstRowLastColumn="0" w:lastRowFirstColumn="0" w:lastRowLastColumn="0"/>
+            </w:pPr>
+            <w:r>
+              <w:t>8</w:t>
+            </w:r>
+          </w:p>
+        </w:tc>
+      </w:tr>
+      <w:tr>
+        <w:tc>
+          <w:tcPr>
+            <w:cnfStyle w:val="001000000000" w:firstRow="0" w:lastRow="0" w:firstColumn="1" w:lastColumn="0" w:oddVBand="0" w:evenVBand="0" w:oddHBand="0" w:evenHBand="0" w:firstRowFirstColumn="0" w:firstRowLastColumn="0" w:lastRowFirstColumn="0" w:lastRowLastColumn="0"/>
+            <w:tcW w:w="1321" w:type="dxa"/>
+          </w:tcPr>
+          <w:p>
+            <w:pPr>
+              <w:pStyle w:val="ListanumeradaTEST"/>
+              <w:numPr>
+                <w:ilvl w:val="0"/>
+                <w:numId w:val="0"/>
+              </w:numPr>
+              <w:rPr>
+                <w:b w:val="0"/>
+                <w:bCs w:val="0"/>
+              </w:rPr>
+            </w:pPr>
+            <w:r>
+              <w:rPr>
+                <w:b w:val="0"/>
+                <w:bCs w:val="0"/>
+              </w:rPr>
+              <w:t>A*</w:t>
+            </w:r>
+          </w:p>
+        </w:tc>
+        <w:tc>
+          <w:tcPr>
+            <w:tcW w:w="1321" w:type="dxa"/>
+          </w:tcPr>
+          <w:p>
+            <w:pPr>
+              <w:pStyle w:val="ListanumeradaTEST"/>
+              <w:numPr>
+                <w:ilvl w:val="0"/>
+                <w:numId w:val="0"/>
+              </w:numPr>
+              <w:cnfStyle w:val="000000000000" w:firstRow="0" w:lastRow="0" w:firstColumn="0" w:lastColumn="0" w:oddVBand="0" w:evenVBand="0" w:oddHBand="0" w:evenHBand="0" w:firstRowFirstColumn="0" w:firstRowLastColumn="0" w:lastRowFirstColumn="0" w:lastRowLastColumn="0"/>
+            </w:pPr>
+            <w:r>
+              <w:t>B1 -&gt; A1 -&gt; A2 -&gt; A3 -&gt; A4 -&gt; A5 -&gt;</w:t>
+            </w:r>
+          </w:p>
+          <w:p>
+            <w:pPr>
+              <w:pStyle w:val="ListanumeradaTEST"/>
+              <w:numPr>
+                <w:ilvl w:val="0"/>
+                <w:numId w:val="0"/>
+              </w:numPr>
+              <w:cnfStyle w:val="000000000000" w:firstRow="0" w:lastRow="0" w:firstColumn="0" w:lastColumn="0" w:oddVBand="0" w:evenVBand="0" w:oddHBand="0" w:evenHBand="0" w:firstRowFirstColumn="0" w:firstRowLastColumn="0" w:lastRowFirstColumn="0" w:lastRowLastColumn="0"/>
+            </w:pPr>
+            <w:r>
+              <w:t>B5 -&gt; C5 -&gt; D5 -&gt; D4 -&gt; C4 -&gt; E3</w:t>
+            </w:r>
+          </w:p>
+        </w:tc>
+        <w:tc>
+          <w:tcPr>
+            <w:tcW w:w="1321" w:type="dxa"/>
+          </w:tcPr>
+          <w:p>
+            <w:pPr>
+              <w:pStyle w:val="ListanumeradaTEST"/>
+              <w:numPr>
+                <w:ilvl w:val="0"/>
+                <w:numId w:val="0"/>
+              </w:numPr>
+              <w:cnfStyle w:val="000000000000" w:firstRow="0" w:lastRow="0" w:firstColumn="0" w:lastColumn="0" w:oddVBand="0" w:evenVBand="0" w:oddHBand="0" w:evenHBand="0" w:firstRowFirstColumn="0" w:firstRowLastColumn="0" w:lastRowFirstColumn="0" w:lastRowLastColumn="0"/>
+            </w:pPr>
+            <w:r>
+              <w:t>12</w:t>
+            </w:r>
+          </w:p>
+        </w:tc>
+        <w:tc>
+          <w:tcPr>
+            <w:tcW w:w="1321" w:type="dxa"/>
+          </w:tcPr>
+          <w:p>
+            <w:pPr>
+              <w:pStyle w:val="ListanumeradaTEST"/>
+              <w:numPr>
+                <w:ilvl w:val="0"/>
+                <w:numId w:val="0"/>
+              </w:numPr>
+              <w:cnfStyle w:val="000000000000" w:firstRow="0" w:lastRow="0" w:firstColumn="0" w:lastColumn="0" w:oddVBand="0" w:evenVBand="0" w:oddHBand="0" w:evenHBand="0" w:firstRowFirstColumn="0" w:firstRowLastColumn="0" w:lastRowFirstColumn="0" w:lastRowLastColumn="0"/>
+            </w:pPr>
+            <w:r>
+              <w:t>14</w:t>
+            </w:r>
+          </w:p>
+        </w:tc>
+        <w:tc>
+          <w:tcPr>
+            <w:tcW w:w="1365" w:type="dxa"/>
+          </w:tcPr>
+          <w:p>
+            <w:pPr>
+              <w:pStyle w:val="ListanumeradaTEST"/>
+              <w:numPr>
+                <w:ilvl w:val="0"/>
+                <w:numId w:val="0"/>
+              </w:numPr>
+              <w:cnfStyle w:val="000000000000" w:firstRow="0" w:lastRow="0" w:firstColumn="0" w:lastColumn="0" w:oddVBand="0" w:evenVBand="0" w:oddHBand="0" w:evenHBand="0" w:firstRowFirstColumn="0" w:firstRowLastColumn="0" w:lastRowFirstColumn="0" w:lastRowLastColumn="0"/>
+            </w:pPr>
+            <w:r>
+              <w:t>26</w:t>
+            </w:r>
+          </w:p>
+        </w:tc>
+        <w:tc>
+          <w:tcPr>
+            <w:tcW w:w="1321" w:type="dxa"/>
+          </w:tcPr>
+          <w:p>
+            <w:pPr>
+              <w:pStyle w:val="ListanumeradaTEST"/>
+              <w:numPr>
+                <w:ilvl w:val="0"/>
+                <w:numId w:val="0"/>
+              </w:numPr>
+              <w:cnfStyle w:val="000000000000" w:firstRow="0" w:lastRow="0" w:firstColumn="0" w:lastColumn="0" w:oddVBand="0" w:evenVBand="0" w:oddHBand="0" w:evenHBand="0" w:firstRowFirstColumn="0" w:firstRowLastColumn="0" w:lastRowFirstColumn="0" w:lastRowLastColumn="0"/>
+            </w:pPr>
+            <w:r>
+              <w:t>10</w:t>
+            </w:r>
+          </w:p>
+        </w:tc>
+      </w:tr>
+    </w:tbl>
+    <w:p>
+      <w:pPr>
+        <w:pStyle w:val="ListanumeradaTEST"/>
+        <w:numPr>
+          <w:ilvl w:val="0"/>
+          <w:numId w:val="0"/>
+        </w:numPr>
+      </w:pPr>
+    </w:p>
+    <w:p>
+      <w:pPr>
+        <w:pStyle w:val="ListanumeradaTEST"/>
+      </w:pPr>
+      <w:r>
+        <w:t>¿Obtiene UCS (Dijkstra) el camino de coste óptimo?</w:t>
       </w:r>
     </w:p>
     <w:p>
@@ -1006,13 +1652,7 @@
         <w:ind w:left="284"/>
       </w:pPr>
       <w:r>
-        <w:t xml:space="preserve">No, porque sabiendo que la ruta </w:t>
-      </w:r>
-      <w:r>
-        <w:t>óptima</w:t>
-      </w:r>
-      <w:r>
-        <w:t xml:space="preserve"> para llegar es 9, con profundidad tenemos 15</w:t>
+        <w:t>Si, aunque realizan más movimientos que el algoritmo de amplitud, su coste es menor, ya que realizan menos movimientos hacia la izquierda.</w:t>
       </w:r>
     </w:p>
     <w:p>
@@ -1020,7 +1660,28 @@
         <w:pStyle w:val="ListanumeradaTEST"/>
       </w:pPr>
       <w:r>
-        <w:t>¿Cuál de los dos algoritmos es más eficiente en este caso particular? Justifique su respuesta.</w:t>
+        <w:t xml:space="preserve">¿Obtiene A* el camino de coste óptimo? </w:t>
+      </w:r>
+    </w:p>
+    <w:p>
+      <w:pPr>
+        <w:pStyle w:val="ListanumeradaTEST"/>
+        <w:numPr>
+          <w:ilvl w:val="0"/>
+          <w:numId w:val="0"/>
+        </w:numPr>
+        <w:ind w:left="568" w:hanging="284"/>
+      </w:pPr>
+      <w:r>
+        <w:t>Si, misma solución que UCS, aunque se realizan más movimientos que amplitud, su coste es menor.</w:t>
+      </w:r>
+    </w:p>
+    <w:p>
+      <w:pPr>
+        <w:pStyle w:val="ListanumeradaTEST"/>
+      </w:pPr>
+      <w:r>
+        <w:t>¿Cuál de los dos algoritmos (UCS o A*) es más eficiente en el caso planteado?</w:t>
       </w:r>
     </w:p>
     <w:p>
@@ -1033,80 +1694,27 @@
         <w:ind w:left="284"/>
       </w:pPr>
       <w:r>
-        <w:t>En este caso, aunque amplitud encuentre el resultado óptimo, profundidad es un algoritmo más eficiente, ya que visitando menos casillas encuentra una solución.</w:t>
-      </w:r>
-      <w:r>
-        <w:br/>
-        <w:t>Amplitud visita 27 y profundidad 20</w:t>
+        <w:lastRenderedPageBreak/>
+        <w:t>En este caso A* visita menos nodos que el algoritmo UCS, aunque su tamaño de lista es más grande.</w:t>
       </w:r>
     </w:p>
-    <w:p/>
     <w:p>
-      <w:r>
-        <w:rPr>
-          <w:b/>
-          <w:bCs/>
-        </w:rPr>
-        <w:t>Caso 2</w:t>
-      </w:r>
-      <w:r>
-        <w:t xml:space="preserve">. En este caso se deben probar y </w:t>
-      </w:r>
-      <w:r>
-        <w:rPr>
-          <w:b/>
-          <w:bCs/>
-        </w:rPr>
-        <w:t>comparar los algoritmos de búsqueda amplitud, Dijkstra y A* cuando hay costes distintos de 1</w:t>
-      </w:r>
-      <w:r>
-        <w:t>. Vea que los ficheros contienen costes modificados para este caso. Para A*, observe que el código proporciona una función heurística basada en la distancia de Manhattan.</w:t>
+      <w:pPr>
+        <w:pStyle w:val="ListanumeradaTEST"/>
+      </w:pPr>
+      <w:r>
+        <w:t xml:space="preserve">¿Se puede afirmar que las respuestas 2 y 3 siempre serán de este modo, aunque se varíe el mapa? </w:t>
       </w:r>
     </w:p>
-    <w:p/>
     <w:p>
       <w:pPr>
         <w:pStyle w:val="ListanumeradaTEST"/>
         <w:numPr>
           <w:ilvl w:val="0"/>
-          <w:numId w:val="47"/>
+          <w:numId w:val="0"/>
         </w:numPr>
-      </w:pPr>
-      <w:r>
-        <w:t>Muestre una tabla con los datos de todas las ejecuciones.</w:t>
-      </w:r>
-    </w:p>
-    <w:p>
-      <w:pPr>
-        <w:pStyle w:val="ListanumeradaTEST"/>
-      </w:pPr>
-      <w:r>
-        <w:t>¿Obtiene UCS (Dijkstra) el camino de coste óptimo?</w:t>
-      </w:r>
-    </w:p>
-    <w:p>
-      <w:pPr>
-        <w:pStyle w:val="ListanumeradaTEST"/>
-      </w:pPr>
-      <w:r>
-        <w:t xml:space="preserve">¿Obtiene A* el camino de coste óptimo? </w:t>
-      </w:r>
-    </w:p>
-    <w:p>
-      <w:pPr>
-        <w:pStyle w:val="ListanumeradaTEST"/>
-      </w:pPr>
-      <w:r>
-        <w:t>¿Cuál de los dos algoritmos (UCS o A*) es más eficiente en el caso planteado?</w:t>
-      </w:r>
-    </w:p>
-    <w:p>
-      <w:pPr>
-        <w:pStyle w:val="ListanumeradaTEST"/>
-      </w:pPr>
-      <w:r>
-        <w:t xml:space="preserve">¿Se puede afirmar que las respuestas 2 y 3 siempre serán de este modo, aunque se varíe el mapa? </w:t>
-      </w:r>
+        <w:ind w:left="284"/>
+      </w:pPr>
     </w:p>
     <w:p>
       <w:pPr>
@@ -1172,7 +1780,6 @@
         </w:numPr>
       </w:pPr>
       <w:r>
-        <w:lastRenderedPageBreak/>
         <w:t>Muestre una tabla con los datos de todas las ejecuciones.</w:t>
       </w:r>
     </w:p>
@@ -1339,7 +1946,6 @@
     <w:p/>
     <w:p>
       <w:r>
-        <w:lastRenderedPageBreak/>
         <w:t>Según rúbrica. El exceso puede descontar puntuación. Puede añadir anexos adicionales, pero no deben contener información imprescindible para entender el texto. Los anexos no tienen por qué tenerse en cuenta en la evaluación. Se debe entregar en formato PDF.</w:t>
       </w:r>
     </w:p>
@@ -6869,10 +7475,6 @@
 </file>
 
 <file path=customXml/item1.xml><?xml version="1.0" encoding="utf-8"?>
-<b:Sources xmlns:b="http://schemas.openxmlformats.org/officeDocument/2006/bibliography" xmlns="http://schemas.openxmlformats.org/officeDocument/2006/bibliography" SelectedStyle="\APASixthEditionOfficeOnline.xsl" StyleName="APA" Version="6"/>
-</file>
-
-<file path=customXml/item2.xml><?xml version="1.0" encoding="utf-8"?>
 <?mso-contentType ?>
 <FormTemplates xmlns="http://schemas.microsoft.com/sharepoint/v3/contenttype/forms">
   <Display>DocumentLibraryForm</Display>
@@ -6881,7 +7483,22 @@
 </FormTemplates>
 </file>
 
+<file path=customXml/item2.xml><?xml version="1.0" encoding="utf-8"?>
+<b:Sources xmlns:b="http://schemas.openxmlformats.org/officeDocument/2006/bibliography" xmlns="http://schemas.openxmlformats.org/officeDocument/2006/bibliography" SelectedStyle="\APASixthEditionOfficeOnline.xsl" StyleName="APA" Version="6"/>
+</file>
+
 <file path=customXml/item3.xml><?xml version="1.0" encoding="utf-8"?>
+<p:properties xmlns:p="http://schemas.microsoft.com/office/2006/metadata/properties" xmlns:xsi="http://www.w3.org/2001/XMLSchema-instance" xmlns:pc="http://schemas.microsoft.com/office/infopath/2007/PartnerControls">
+  <documentManagement>
+    <lcf76f155ced4ddcb4097134ff3c332f xmlns="6e910c33-da69-4938-9830-da7434244dc6">
+      <Terms xmlns="http://schemas.microsoft.com/office/infopath/2007/PartnerControls"/>
+    </lcf76f155ced4ddcb4097134ff3c332f>
+    <TaxCatchAll xmlns="e6a0f6c9-87c6-47e0-9624-423836407d4c" xsi:nil="true"/>
+  </documentManagement>
+</p:properties>
+</file>
+
+<file path=customXml/item4.xml><?xml version="1.0" encoding="utf-8"?>
 <ct:contentTypeSchema xmlns:ct="http://schemas.microsoft.com/office/2006/metadata/contentType" xmlns:ma="http://schemas.microsoft.com/office/2006/metadata/properties/metaAttributes" ct:_="" ma:_="" ma:contentTypeName="Documento" ma:contentTypeID="0x010100C64B0FDC57170C4E937DC208D9BFB35D" ma:contentTypeVersion="13" ma:contentTypeDescription="Crear nuevo documento." ma:contentTypeScope="" ma:versionID="0bd382fa9a15b28607fd9311220ea7fa">
   <xsd:schema xmlns:xsd="http://www.w3.org/2001/XMLSchema" xmlns:xs="http://www.w3.org/2001/XMLSchema" xmlns:p="http://schemas.microsoft.com/office/2006/metadata/properties" xmlns:ns2="6e910c33-da69-4938-9830-da7434244dc6" xmlns:ns3="e6a0f6c9-87c6-47e0-9624-423836407d4c" targetNamespace="http://schemas.microsoft.com/office/2006/metadata/properties" ma:root="true" ma:fieldsID="e84e087303cac23fd08c3bd19af044d0" ns2:_="" ns3:_="">
     <xsd:import namespace="6e910c33-da69-4938-9830-da7434244dc6"/>
@@ -7088,18 +7705,15 @@
 </ct:contentTypeSchema>
 </file>
 
-<file path=customXml/item4.xml><?xml version="1.0" encoding="utf-8"?>
-<p:properties xmlns:p="http://schemas.microsoft.com/office/2006/metadata/properties" xmlns:xsi="http://www.w3.org/2001/XMLSchema-instance" xmlns:pc="http://schemas.microsoft.com/office/infopath/2007/PartnerControls">
-  <documentManagement>
-    <lcf76f155ced4ddcb4097134ff3c332f xmlns="6e910c33-da69-4938-9830-da7434244dc6">
-      <Terms xmlns="http://schemas.microsoft.com/office/infopath/2007/PartnerControls"/>
-    </lcf76f155ced4ddcb4097134ff3c332f>
-    <TaxCatchAll xmlns="e6a0f6c9-87c6-47e0-9624-423836407d4c" xsi:nil="true"/>
-  </documentManagement>
-</p:properties>
+<file path=customXml/itemProps1.xml><?xml version="1.0" encoding="utf-8"?>
+<ds:datastoreItem xmlns:ds="http://schemas.openxmlformats.org/officeDocument/2006/customXml" ds:itemID="{DADA22EA-30AF-48ED-8DC0-06AFFED52517}">
+  <ds:schemaRefs>
+    <ds:schemaRef ds:uri="http://schemas.microsoft.com/sharepoint/v3/contenttype/forms"/>
+  </ds:schemaRefs>
+</ds:datastoreItem>
 </file>
 
-<file path=customXml/itemProps1.xml><?xml version="1.0" encoding="utf-8"?>
+<file path=customXml/itemProps2.xml><?xml version="1.0" encoding="utf-8"?>
 <ds:datastoreItem xmlns:ds="http://schemas.openxmlformats.org/officeDocument/2006/customXml" ds:itemID="{68EF0881-AFE3-44EB-8834-1E31251C8A76}">
   <ds:schemaRefs>
     <ds:schemaRef ds:uri="http://schemas.openxmlformats.org/officeDocument/2006/bibliography"/>
@@ -7107,15 +7721,18 @@
 </ds:datastoreItem>
 </file>
 
-<file path=customXml/itemProps2.xml><?xml version="1.0" encoding="utf-8"?>
-<ds:datastoreItem xmlns:ds="http://schemas.openxmlformats.org/officeDocument/2006/customXml" ds:itemID="{DADA22EA-30AF-48ED-8DC0-06AFFED52517}">
+<file path=customXml/itemProps3.xml><?xml version="1.0" encoding="utf-8"?>
+<ds:datastoreItem xmlns:ds="http://schemas.openxmlformats.org/officeDocument/2006/customXml" ds:itemID="{5DA6F32C-6FAE-4705-8722-B42C5F1E24E2}">
   <ds:schemaRefs>
-    <ds:schemaRef ds:uri="http://schemas.microsoft.com/sharepoint/v3/contenttype/forms"/>
+    <ds:schemaRef ds:uri="http://schemas.microsoft.com/office/2006/metadata/properties"/>
+    <ds:schemaRef ds:uri="http://schemas.microsoft.com/office/infopath/2007/PartnerControls"/>
+    <ds:schemaRef ds:uri="6e910c33-da69-4938-9830-da7434244dc6"/>
+    <ds:schemaRef ds:uri="e6a0f6c9-87c6-47e0-9624-423836407d4c"/>
   </ds:schemaRefs>
 </ds:datastoreItem>
 </file>
 
-<file path=customXml/itemProps3.xml><?xml version="1.0" encoding="utf-8"?>
+<file path=customXml/itemProps4.xml><?xml version="1.0" encoding="utf-8"?>
 <ds:datastoreItem xmlns:ds="http://schemas.openxmlformats.org/officeDocument/2006/customXml" ds:itemID="{F7862329-13BF-43A7-9509-19FACDEF6EB1}">
   <ds:schemaRefs>
     <ds:schemaRef ds:uri="http://schemas.microsoft.com/office/2006/metadata/contentType"/>
@@ -7134,17 +7751,6 @@
 </ds:datastoreItem>
 </file>
 
-<file path=customXml/itemProps4.xml><?xml version="1.0" encoding="utf-8"?>
-<ds:datastoreItem xmlns:ds="http://schemas.openxmlformats.org/officeDocument/2006/customXml" ds:itemID="{5DA6F32C-6FAE-4705-8722-B42C5F1E24E2}">
-  <ds:schemaRefs>
-    <ds:schemaRef ds:uri="http://schemas.microsoft.com/office/2006/metadata/properties"/>
-    <ds:schemaRef ds:uri="http://schemas.microsoft.com/office/infopath/2007/PartnerControls"/>
-    <ds:schemaRef ds:uri="6e910c33-da69-4938-9830-da7434244dc6"/>
-    <ds:schemaRef ds:uri="e6a0f6c9-87c6-47e0-9624-423836407d4c"/>
-  </ds:schemaRefs>
-</ds:datastoreItem>
-</file>
-
 <file path=docMetadata/LabelInfo.xml><?xml version="1.0" encoding="utf-8"?>
 <clbl:labelList xmlns:clbl="http://schemas.microsoft.com/office/2020/mipLabelMetadata">
   <clbl:label id="{0361ecad-3f61-4749-aa5c-87fde47ef9ad}" enabled="1" method="Privileged" siteId="{22c8b4a4-d926-43b2-bcc7-87b998590b47}" contentBits="0" removed="0"/>

</xml_diff>